<commit_message>
updated team page and docs wording
</commit_message>
<xml_diff>
--- a/docs/Sharma_RobotArena_Proposal.docx
+++ b/docs/Sharma_RobotArena_Proposal.docx
@@ -367,7 +367,7 @@
                 <w:sz w:val="21"/>
                 <w:szCs w:val="21"/>
               </w:rPr>
-              <w:t xml:space="preserve">Rajan Sharma (solo; Project Leader and only member)</w:t>
+              <w:t xml:space="preserve">Rajan Sharma (Project Leader)</w:t>
             </w:r>
           </w:p>
         </w:tc>
@@ -517,7 +517,7 @@
         <w:spacing w:after="120"/>
       </w:pPr>
       <w:r>
-        <w:t xml:space="preserve">This is a solo project. I am the Project Leader and the only member, so I cover every role the course lists for a team.</w:t>
+        <w:t xml:space="preserve">Rajan Sharma is the Project Leader and covers every role the course lists for a team.</w:t>
       </w:r>
     </w:p>
     <w:tbl>
@@ -730,7 +730,7 @@
                 <w:sz w:val="19"/>
                 <w:szCs w:val="19"/>
               </w:rPr>
-              <w:t xml:space="preserve">Project Leader (solo)</w:t>
+              <w:t xml:space="preserve">Project Leader</w:t>
             </w:r>
           </w:p>
         </w:tc>

</xml_diff>